<commit_message>
clase 4 mejor centrada en el tema de las preguntas del cuaderno de trabajo
</commit_message>
<xml_diff>
--- a/3_lenguaje_proposicional/clase_04_posibilidades_logicas/estrategias_o_habilidades_a_adquirir/clase_sobre_interpretacion_de_graficos.docx
+++ b/3_lenguaje_proposicional/clase_04_posibilidades_logicas/estrategias_o_habilidades_a_adquirir/clase_sobre_interpretacion_de_graficos.docx
@@ -2,48 +2,7 @@
 <file path=word/document.xml><?xml version="1.0" encoding="utf-8"?>
 <w:document xmlns:wpc="http://schemas.microsoft.com/office/word/2010/wordprocessingCanvas" xmlns:cx="http://schemas.microsoft.com/office/drawing/2014/chartex" xmlns:cx1="http://schemas.microsoft.com/office/drawing/2015/9/8/chartex" xmlns:cx2="http://schemas.microsoft.com/office/drawing/2015/10/21/chartex" xmlns:cx3="http://schemas.microsoft.com/office/drawing/2016/5/9/chartex" xmlns:cx4="http://schemas.microsoft.com/office/drawing/2016/5/10/chartex" xmlns:cx5="http://schemas.microsoft.com/office/drawing/2016/5/11/chartex" xmlns:cx6="http://schemas.microsoft.com/office/drawing/2016/5/12/chartex" xmlns:cx7="http://schemas.microsoft.com/office/drawing/2016/5/13/chartex" xmlns:cx8="http://schemas.microsoft.com/office/drawing/2016/5/14/chartex" xmlns:mc="http://schemas.openxmlformats.org/markup-compatibility/2006" xmlns:aink="http://schemas.microsoft.com/office/drawing/2016/ink" xmlns:am3d="http://schemas.microsoft.com/office/drawing/2017/model3d" xmlns:o="urn:schemas-microsoft-com:office:office" xmlns:oel="http://schemas.microsoft.com/office/2019/extlst" xmlns:r="http://schemas.openxmlformats.org/officeDocument/2006/relationships" xmlns:m="http://schemas.openxmlformats.org/officeDocument/2006/math" xmlns:v="urn:schemas-microsoft-com:vml" xmlns:wp14="http://schemas.microsoft.com/office/word/2010/wordprocessingDrawing" xmlns:wp="http://schemas.openxmlformats.org/drawingml/2006/wordprocessingDrawing" xmlns:w10="urn:schemas-microsoft-com:office:word" xmlns:w="http://schemas.openxmlformats.org/wordprocessingml/2006/main" xmlns:w14="http://schemas.microsoft.com/office/word/2010/wordml" xmlns:w15="http://schemas.microsoft.com/office/word/2012/wordml" xmlns:w16cex="http://schemas.microsoft.com/office/word/2018/wordml/cex" xmlns:w16cid="http://schemas.microsoft.com/office/word/2016/wordml/cid" xmlns:w16="http://schemas.microsoft.com/office/word/2018/wordml" xmlns:w16du="http://schemas.microsoft.com/office/word/2023/wordml/word16du" xmlns:w16sdtdh="http://schemas.microsoft.com/office/word/2020/wordml/sdtdatahash" xmlns:w16sdtfl="http://schemas.microsoft.com/office/word/2024/wordml/sdtformatlock" xmlns:w16se="http://schemas.microsoft.com/office/word/2015/wordml/symex" xmlns:wpg="http://schemas.microsoft.com/office/word/2010/wordprocessingGroup" xmlns:wpi="http://schemas.microsoft.com/office/word/2010/wordprocessingInk" xmlns:wne="http://schemas.microsoft.com/office/word/2006/wordml" xmlns:wps="http://schemas.microsoft.com/office/word/2010/wordprocessingShape" mc:Ignorable="w14 w15 w16se w16cid w16 w16cex w16sdtdh w16sdtfl w16du wp14">
   <w:body>
-    <w:p>
-      <w:r>
-        <w:t xml:space="preserve">Esta es una propuesta de clase diseñada específicamente para el contexto de </w:t>
-      </w:r>
-      <w:r>
-        <w:rPr>
-          <w:b/>
-          <w:bCs/>
-        </w:rPr>
-        <w:t>Puerto Libertador</w:t>
-      </w:r>
-      <w:r>
-        <w:t xml:space="preserve">, enfocada en el componente de Razonamiento Lógico que evalúa la </w:t>
-      </w:r>
-      <w:r>
-        <w:rPr>
-          <w:b/>
-          <w:bCs/>
-        </w:rPr>
-        <w:t>Universidad de Antioquia (UdeA)</w:t>
-      </w:r>
-      <w:r>
-        <w:t xml:space="preserve"> y las pruebas </w:t>
-      </w:r>
-      <w:r>
-        <w:rPr>
-          <w:b/>
-          <w:bCs/>
-        </w:rPr>
-        <w:t>Saber 11</w:t>
-      </w:r>
-      <w:r>
-        <w:t>.</w:t>
-      </w:r>
-    </w:p>
-    <w:p>
-      <w:r>
-        <w:pict w14:anchorId="66BCE4FF">
-          <v:rect id="_x0000_i1067" style="width:0;height:1.5pt" o:hralign="center" o:hrstd="t" o:hrnoshade="t" o:hr="t" fillcolor="gray" stroked="f"/>
-        </w:pict>
-      </w:r>
-    </w:p>
+    <w:p/>
     <w:p>
       <w:pPr>
         <w:rPr>
@@ -86,7 +45,7 @@
     <w:p>
       <w:r>
         <w:pict w14:anchorId="77A9F8A1">
-          <v:rect id="_x0000_i1068" style="width:0;height:1.5pt" o:hralign="center" o:hrstd="t" o:hrnoshade="t" o:hr="t" fillcolor="gray" stroked="f"/>
+          <v:rect id="_x0000_i1026" style="width:0;height:1.5pt" o:hralign="center" o:hrstd="t" o:hrnoshade="t" o:hr="t" fillcolor="gray" stroked="f"/>
         </w:pict>
       </w:r>
     </w:p>
@@ -161,7 +120,7 @@
     <w:p>
       <w:r>
         <w:pict w14:anchorId="4EB42B34">
-          <v:rect id="_x0000_i1069" style="width:0;height:1.5pt" o:hralign="center" o:hrstd="t" o:hrnoshade="t" o:hr="t" fillcolor="gray" stroked="f"/>
+          <v:rect id="_x0000_i1027" style="width:0;height:1.5pt" o:hralign="center" o:hrstd="t" o:hrnoshade="t" o:hr="t" fillcolor="gray" stroked="f"/>
         </w:pict>
       </w:r>
     </w:p>
@@ -287,7 +246,6 @@
           <w:b/>
           <w:bCs/>
         </w:rPr>
-        <w:lastRenderedPageBreak/>
         <w:t>Pendiente Positiva ($m &gt; 0$):</w:t>
       </w:r>
       <w:r>
@@ -344,6 +302,7 @@
           <w:b/>
           <w:bCs/>
         </w:rPr>
+        <w:lastRenderedPageBreak/>
         <w:t>Pendiente Cero ($m = 0$):</w:t>
       </w:r>
       <w:r>
@@ -439,7 +398,7 @@
     <w:p>
       <w:r>
         <w:pict w14:anchorId="70EA4753">
-          <v:rect id="_x0000_i1070" style="width:0;height:1.5pt" o:hralign="center" o:hrstd="t" o:hrnoshade="t" o:hr="t" fillcolor="gray" stroked="f"/>
+          <v:rect id="_x0000_i1028" style="width:0;height:1.5pt" o:hralign="center" o:hrstd="t" o:hrnoshade="t" o:hr="t" fillcolor="gray" stroked="f"/>
         </w:pict>
       </w:r>
     </w:p>
@@ -738,7 +697,6 @@
                 <w:b/>
                 <w:bCs/>
               </w:rPr>
-              <w:lastRenderedPageBreak/>
               <w:t>Dos líneas paralelas</w:t>
             </w:r>
           </w:p>
@@ -772,7 +730,7 @@
     <w:p>
       <w:r>
         <w:pict w14:anchorId="66BF2865">
-          <v:rect id="_x0000_i1071" style="width:0;height:1.5pt" o:hralign="center" o:hrstd="t" o:hrnoshade="t" o:hr="t" fillcolor="gray" stroked="f"/>
+          <v:rect id="_x0000_i1029" style="width:0;height:1.5pt" o:hralign="center" o:hrstd="t" o:hrnoshade="t" o:hr="t" fillcolor="gray" stroked="f"/>
         </w:pict>
       </w:r>
     </w:p>
@@ -788,6 +746,7 @@
           <w:b/>
           <w:bCs/>
         </w:rPr>
+        <w:lastRenderedPageBreak/>
         <w:t>4. Entrenamiento Tipo UdeA (15 min)</w:t>
       </w:r>
     </w:p>
@@ -871,7 +830,7 @@
     <w:p>
       <w:r>
         <w:pict w14:anchorId="4E7DA499">
-          <v:rect id="_x0000_i1072" style="width:0;height:1.5pt" o:hralign="center" o:hrstd="t" o:hrnoshade="t" o:hr="t" fillcolor="gray" stroked="f"/>
+          <v:rect id="_x0000_i1030" style="width:0;height:1.5pt" o:hralign="center" o:hrstd="t" o:hrnoshade="t" o:hr="t" fillcolor="gray" stroked="f"/>
         </w:pict>
       </w:r>
     </w:p>
@@ -928,7 +887,7 @@
     <w:p>
       <w:r>
         <w:pict w14:anchorId="45206FBA">
-          <v:rect id="_x0000_i1073" style="width:0;height:1.5pt" o:hralign="center" o:hrstd="t" o:hrnoshade="t" o:hr="t" fillcolor="gray" stroked="f"/>
+          <v:rect id="_x0000_i1031" style="width:0;height:1.5pt" o:hralign="center" o:hrstd="t" o:hrnoshade="t" o:hr="t" fillcolor="gray" stroked="f"/>
         </w:pict>
       </w:r>
     </w:p>
@@ -980,79 +939,79 @@
         <w:rPr>
           <w:u w:val="single"/>
         </w:rPr>
+        <w:t xml:space="preserve">Manejar un grupo de 49 estudiantes es un reto logístico, pero para temas de </w:t>
+      </w:r>
+      <w:r>
+        <w:rPr>
+          <w:b/>
+          <w:bCs/>
+          <w:u w:val="single"/>
+        </w:rPr>
+        <w:t>Funciones Lineales</w:t>
+      </w:r>
+      <w:r>
+        <w:rPr>
+          <w:u w:val="single"/>
+        </w:rPr>
+        <w:t>, el movimiento físico es la mejor herramienta para que el cerebro asimile conceptos como "pendiente negativa" o "intercepto".</w:t>
+      </w:r>
+    </w:p>
+    <w:p>
+      <w:pPr>
+        <w:rPr>
+          <w:u w:val="single"/>
+        </w:rPr>
+      </w:pPr>
+      <w:r>
+        <w:rPr>
+          <w:u w:val="single"/>
+        </w:rPr>
+        <w:t>Aquí tienes dos juegos diseñados para un salón numeroso, que funcionan como pausas activas y refuerzo pedagógico:</w:t>
+      </w:r>
+    </w:p>
+    <w:p>
+      <w:pPr>
+        <w:rPr>
+          <w:u w:val="single"/>
+        </w:rPr>
+      </w:pPr>
+      <w:r>
+        <w:rPr>
+          <w:u w:val="single"/>
+        </w:rPr>
+        <w:pict w14:anchorId="013EA78E">
+          <v:rect id="_x0000_i1032" style="width:0;height:1.5pt" o:hralign="center" o:hrstd="t" o:hrnoshade="t" o:hr="t" fillcolor="gray" stroked="f"/>
+        </w:pict>
+      </w:r>
+    </w:p>
+    <w:p>
+      <w:pPr>
+        <w:rPr>
+          <w:b/>
+          <w:bCs/>
+          <w:u w:val="single"/>
+        </w:rPr>
+      </w:pPr>
+      <w:r>
+        <w:rPr>
+          <w:b/>
+          <w:bCs/>
+          <w:u w:val="single"/>
+        </w:rPr>
+        <w:t>1. El Juego del "Espejo Humano" (Cinemática en Vivo)</w:t>
+      </w:r>
+    </w:p>
+    <w:p>
+      <w:pPr>
+        <w:rPr>
+          <w:u w:val="single"/>
+        </w:rPr>
+      </w:pPr>
+      <w:r>
+        <w:rPr>
+          <w:u w:val="single"/>
+        </w:rPr>
         <w:lastRenderedPageBreak/>
-        <w:t xml:space="preserve">Manejar un grupo de 49 estudiantes es un reto logístico, pero para temas de </w:t>
-      </w:r>
-      <w:r>
-        <w:rPr>
-          <w:b/>
-          <w:bCs/>
-          <w:u w:val="single"/>
-        </w:rPr>
-        <w:t>Funciones Lineales</w:t>
-      </w:r>
-      <w:r>
-        <w:rPr>
-          <w:u w:val="single"/>
-        </w:rPr>
-        <w:t>, el movimiento físico es la mejor herramienta para que el cerebro asimile conceptos como "pendiente negativa" o "intercepto".</w:t>
-      </w:r>
-    </w:p>
-    <w:p>
-      <w:pPr>
-        <w:rPr>
-          <w:u w:val="single"/>
-        </w:rPr>
-      </w:pPr>
-      <w:r>
-        <w:rPr>
-          <w:u w:val="single"/>
-        </w:rPr>
-        <w:t>Aquí tienes dos juegos diseñados para un salón numeroso, que funcionan como pausas activas y refuerzo pedagógico:</w:t>
-      </w:r>
-    </w:p>
-    <w:p>
-      <w:pPr>
-        <w:rPr>
-          <w:u w:val="single"/>
-        </w:rPr>
-      </w:pPr>
-      <w:r>
-        <w:rPr>
-          <w:u w:val="single"/>
-        </w:rPr>
-        <w:pict w14:anchorId="013EA78E">
-          <v:rect id="_x0000_i1099" style="width:0;height:1.5pt" o:hralign="center" o:hrstd="t" o:hrnoshade="t" o:hr="t" fillcolor="gray" stroked="f"/>
-        </w:pict>
-      </w:r>
-    </w:p>
-    <w:p>
-      <w:pPr>
-        <w:rPr>
-          <w:b/>
-          <w:bCs/>
-          <w:u w:val="single"/>
-        </w:rPr>
-      </w:pPr>
-      <w:r>
-        <w:rPr>
-          <w:b/>
-          <w:bCs/>
-          <w:u w:val="single"/>
-        </w:rPr>
-        <w:t>1. El Juego del "Espejo Humano" (Cinemática en Vivo)</w:t>
-      </w:r>
-    </w:p>
-    <w:p>
-      <w:pPr>
-        <w:rPr>
-          <w:u w:val="single"/>
-        </w:rPr>
-      </w:pPr>
-      <w:r>
-        <w:rPr>
-          <w:u w:val="single"/>
-        </w:rPr>
         <w:t>Este juego convierte el cuerpo de los estudiantes en la línea del gráfico. Refuerza la relación entre el movimiento físico y su representación visual.</w:t>
       </w:r>
     </w:p>
@@ -1278,7 +1237,7 @@
           <w:u w:val="single"/>
         </w:rPr>
         <w:pict w14:anchorId="5BAE9520">
-          <v:rect id="_x0000_i1100" style="width:0;height:1.5pt" o:hralign="center" o:hrstd="t" o:hrnoshade="t" o:hr="t" fillcolor="gray" stroked="f"/>
+          <v:rect id="_x0000_i1033" style="width:0;height:1.5pt" o:hralign="center" o:hrstd="t" o:hrnoshade="t" o:hr="t" fillcolor="gray" stroked="f"/>
         </w:pict>
       </w:r>
     </w:p>
@@ -1309,7 +1268,6 @@
         <w:rPr>
           <w:u w:val="single"/>
         </w:rPr>
-        <w:lastRenderedPageBreak/>
         <w:t xml:space="preserve">Este juego es excelente para visualizar la </w:t>
       </w:r>
       <w:r>
@@ -1430,6 +1388,7 @@
         <w:rPr>
           <w:u w:val="single"/>
         </w:rPr>
+        <w:lastRenderedPageBreak/>
         <w:t>Divide a los 49 estudiantes en 4 equipos.</w:t>
       </w:r>
     </w:p>
@@ -1626,7 +1585,7 @@
           <w:u w:val="single"/>
         </w:rPr>
         <w:pict w14:anchorId="539BE2B6">
-          <v:rect id="_x0000_i1101" style="width:0;height:1.5pt" o:hralign="center" o:hrstd="t" o:hrnoshade="t" o:hr="t" fillcolor="gray" stroked="f"/>
+          <v:rect id="_x0000_i1034" style="width:0;height:1.5pt" o:hralign="center" o:hrstd="t" o:hrnoshade="t" o:hr="t" fillcolor="gray" stroked="f"/>
         </w:pict>
       </w:r>
     </w:p>
@@ -1713,7 +1672,6 @@
           <w:bCs/>
           <w:u w:val="single"/>
         </w:rPr>
-        <w:lastRenderedPageBreak/>
         <w:t>Desmitificación:</w:t>
       </w:r>
       <w:r>
@@ -3765,6 +3723,7 @@
   <w:style w:type="character" w:default="1" w:styleId="Fuentedeprrafopredeter">
     <w:name w:val="Default Paragraph Font"/>
     <w:uiPriority w:val="1"/>
+    <w:semiHidden/>
     <w:unhideWhenUsed/>
   </w:style>
   <w:style w:type="table" w:default="1" w:styleId="Tablanormal">

</xml_diff>